<commit_message>
Informe: agregar tabla-leyenda de grupos por color y esquema de planta coloreada
</commit_message>
<xml_diff>
--- a/Proyectos/Diseno-Estructural/INFORME-VIGAS-VIGUETAS-RIOSTRAS.docx
+++ b/Proyectos/Diseno-Estructural/INFORME-VIGAS-VIGUETAS-RIOSTRAS.docx
@@ -398,6 +398,1011 @@
           <w:sz w:val="22"/>
         </w:rPr>
         <w:t>Atendiendo el criterio de agrupar únicamente los elementos que comparten la MISMA longitud y la MISMA condición de apoyo, las vigas se clasificaron en 12 tipos de vigas de carga (VC-1 a VC-12) y 16 tipos de vigas de rigidez (VR-1 a VR-16). Cada tipo se diseñó con la mayor solicitación de su grupo. Adicionalmente, y como respaldo, se diseñó cada una de las 592 vigas de manera individual con sus propias solicitaciones.</w:t>
+      </w:r>
+    </w:p>
+    <w:p>
+      <w:pPr>
+        <w:jc w:val="both"/>
+      </w:pPr>
+      <w:r>
+        <w:rPr>
+          <w:b w:val="0"/>
+          <w:i w:val="0"/>
+          <w:sz w:val="22"/>
+        </w:rPr>
+        <w:t>En la herramienta de cálculo cada viga se identifica con un color según su grupo (mismo color = misma longitud, es decir mismo grupo). La siguiente tabla resume la agrupación por longitud:</w:t>
+      </w:r>
+    </w:p>
+    <w:tbl>
+      <w:tblPr>
+        <w:tblStyle w:val="LightGrid-Accent1"/>
+        <w:tblW w:type="auto" w:w="0"/>
+        <w:jc w:val="center"/>
+        <w:tblLook w:firstColumn="1" w:firstRow="1" w:lastColumn="0" w:lastRow="0" w:noHBand="0" w:noVBand="1" w:val="04A0"/>
+      </w:tblPr>
+      <w:tblGrid>
+        <w:gridCol w:w="2160"/>
+        <w:gridCol w:w="2160"/>
+        <w:gridCol w:w="2160"/>
+        <w:gridCol w:w="2160"/>
+      </w:tblGrid>
+      <w:tr>
+        <w:tc>
+          <w:tcPr>
+            <w:tcW w:type="dxa" w:w="2160"/>
+          </w:tcPr>
+          <w:p>
+            <w:r>
+              <w:rPr>
+                <w:b/>
+                <w:sz w:val="20"/>
+              </w:rPr>
+              <w:t>Color</w:t>
+            </w:r>
+          </w:p>
+        </w:tc>
+        <w:tc>
+          <w:tcPr>
+            <w:tcW w:type="dxa" w:w="2160"/>
+          </w:tcPr>
+          <w:p>
+            <w:r>
+              <w:rPr>
+                <w:b/>
+                <w:sz w:val="20"/>
+              </w:rPr>
+              <w:t>Longitud [m]</w:t>
+            </w:r>
+          </w:p>
+        </w:tc>
+        <w:tc>
+          <w:tcPr>
+            <w:tcW w:type="dxa" w:w="2160"/>
+          </w:tcPr>
+          <w:p>
+            <w:r>
+              <w:rPr>
+                <w:b/>
+                <w:sz w:val="20"/>
+              </w:rPr>
+              <w:t>Sección</w:t>
+            </w:r>
+          </w:p>
+        </w:tc>
+        <w:tc>
+          <w:tcPr>
+            <w:tcW w:type="dxa" w:w="2160"/>
+          </w:tcPr>
+          <w:p>
+            <w:r>
+              <w:rPr>
+                <w:b/>
+                <w:sz w:val="20"/>
+              </w:rPr>
+              <w:t>N° vigas</w:t>
+            </w:r>
+          </w:p>
+        </w:tc>
+      </w:tr>
+      <w:tr>
+        <w:tc>
+          <w:tcPr>
+            <w:tcW w:type="dxa" w:w="2160"/>
+            <w:shd w:val="clear" w:color="auto" w:fill="FFC7CE"/>
+          </w:tcPr>
+          <w:p/>
+        </w:tc>
+        <w:tc>
+          <w:tcPr>
+            <w:tcW w:type="dxa" w:w="2160"/>
+          </w:tcPr>
+          <w:p>
+            <w:r>
+              <w:rPr>
+                <w:sz w:val="20"/>
+              </w:rPr>
+              <w:t>1.50</w:t>
+            </w:r>
+          </w:p>
+        </w:tc>
+        <w:tc>
+          <w:tcPr>
+            <w:tcW w:type="dxa" w:w="2160"/>
+          </w:tcPr>
+          <w:p>
+            <w:r>
+              <w:rPr>
+                <w:sz w:val="20"/>
+              </w:rPr>
+              <w:t>VR</w:t>
+            </w:r>
+          </w:p>
+        </w:tc>
+        <w:tc>
+          <w:tcPr>
+            <w:tcW w:type="dxa" w:w="2160"/>
+          </w:tcPr>
+          <w:p>
+            <w:r>
+              <w:rPr>
+                <w:sz w:val="20"/>
+              </w:rPr>
+              <w:t>30</w:t>
+            </w:r>
+          </w:p>
+        </w:tc>
+      </w:tr>
+      <w:tr>
+        <w:tc>
+          <w:tcPr>
+            <w:tcW w:type="dxa" w:w="2160"/>
+            <w:shd w:val="clear" w:color="auto" w:fill="C6EFCE"/>
+          </w:tcPr>
+          <w:p/>
+        </w:tc>
+        <w:tc>
+          <w:tcPr>
+            <w:tcW w:type="dxa" w:w="2160"/>
+          </w:tcPr>
+          <w:p>
+            <w:r>
+              <w:rPr>
+                <w:sz w:val="20"/>
+              </w:rPr>
+              <w:t>2.50</w:t>
+            </w:r>
+          </w:p>
+        </w:tc>
+        <w:tc>
+          <w:tcPr>
+            <w:tcW w:type="dxa" w:w="2160"/>
+          </w:tcPr>
+          <w:p>
+            <w:r>
+              <w:rPr>
+                <w:sz w:val="20"/>
+              </w:rPr>
+              <w:t>VC/VR (mixta)</w:t>
+            </w:r>
+          </w:p>
+        </w:tc>
+        <w:tc>
+          <w:tcPr>
+            <w:tcW w:type="dxa" w:w="2160"/>
+          </w:tcPr>
+          <w:p>
+            <w:r>
+              <w:rPr>
+                <w:sz w:val="20"/>
+              </w:rPr>
+              <w:t>70</w:t>
+            </w:r>
+          </w:p>
+        </w:tc>
+      </w:tr>
+      <w:tr>
+        <w:tc>
+          <w:tcPr>
+            <w:tcW w:type="dxa" w:w="2160"/>
+            <w:shd w:val="clear" w:color="auto" w:fill="FFEB9C"/>
+          </w:tcPr>
+          <w:p/>
+        </w:tc>
+        <w:tc>
+          <w:tcPr>
+            <w:tcW w:type="dxa" w:w="2160"/>
+          </w:tcPr>
+          <w:p>
+            <w:r>
+              <w:rPr>
+                <w:sz w:val="20"/>
+              </w:rPr>
+              <w:t>2.60</w:t>
+            </w:r>
+          </w:p>
+        </w:tc>
+        <w:tc>
+          <w:tcPr>
+            <w:tcW w:type="dxa" w:w="2160"/>
+          </w:tcPr>
+          <w:p>
+            <w:r>
+              <w:rPr>
+                <w:sz w:val="20"/>
+              </w:rPr>
+              <w:t>VC/VR (mixta)</w:t>
+            </w:r>
+          </w:p>
+        </w:tc>
+        <w:tc>
+          <w:tcPr>
+            <w:tcW w:type="dxa" w:w="2160"/>
+          </w:tcPr>
+          <w:p>
+            <w:r>
+              <w:rPr>
+                <w:sz w:val="20"/>
+              </w:rPr>
+              <w:t>110</w:t>
+            </w:r>
+          </w:p>
+        </w:tc>
+      </w:tr>
+      <w:tr>
+        <w:tc>
+          <w:tcPr>
+            <w:tcW w:type="dxa" w:w="2160"/>
+            <w:shd w:val="clear" w:color="auto" w:fill="BDD7EE"/>
+          </w:tcPr>
+          <w:p/>
+        </w:tc>
+        <w:tc>
+          <w:tcPr>
+            <w:tcW w:type="dxa" w:w="2160"/>
+          </w:tcPr>
+          <w:p>
+            <w:r>
+              <w:rPr>
+                <w:sz w:val="20"/>
+              </w:rPr>
+              <w:t>2.65</w:t>
+            </w:r>
+          </w:p>
+        </w:tc>
+        <w:tc>
+          <w:tcPr>
+            <w:tcW w:type="dxa" w:w="2160"/>
+          </w:tcPr>
+          <w:p>
+            <w:r>
+              <w:rPr>
+                <w:sz w:val="20"/>
+              </w:rPr>
+              <w:t>VC</w:t>
+            </w:r>
+          </w:p>
+        </w:tc>
+        <w:tc>
+          <w:tcPr>
+            <w:tcW w:type="dxa" w:w="2160"/>
+          </w:tcPr>
+          <w:p>
+            <w:r>
+              <w:rPr>
+                <w:sz w:val="20"/>
+              </w:rPr>
+              <w:t>20</w:t>
+            </w:r>
+          </w:p>
+        </w:tc>
+      </w:tr>
+      <w:tr>
+        <w:tc>
+          <w:tcPr>
+            <w:tcW w:type="dxa" w:w="2160"/>
+            <w:shd w:val="clear" w:color="auto" w:fill="F8CBAD"/>
+          </w:tcPr>
+          <w:p/>
+        </w:tc>
+        <w:tc>
+          <w:tcPr>
+            <w:tcW w:type="dxa" w:w="2160"/>
+          </w:tcPr>
+          <w:p>
+            <w:r>
+              <w:rPr>
+                <w:sz w:val="20"/>
+              </w:rPr>
+              <w:t>2.70</w:t>
+            </w:r>
+          </w:p>
+        </w:tc>
+        <w:tc>
+          <w:tcPr>
+            <w:tcW w:type="dxa" w:w="2160"/>
+          </w:tcPr>
+          <w:p>
+            <w:r>
+              <w:rPr>
+                <w:sz w:val="20"/>
+              </w:rPr>
+              <w:t>VR</w:t>
+            </w:r>
+          </w:p>
+        </w:tc>
+        <w:tc>
+          <w:tcPr>
+            <w:tcW w:type="dxa" w:w="2160"/>
+          </w:tcPr>
+          <w:p>
+            <w:r>
+              <w:rPr>
+                <w:sz w:val="20"/>
+              </w:rPr>
+              <w:t>15</w:t>
+            </w:r>
+          </w:p>
+        </w:tc>
+      </w:tr>
+      <w:tr>
+        <w:tc>
+          <w:tcPr>
+            <w:tcW w:type="dxa" w:w="2160"/>
+            <w:shd w:val="clear" w:color="auto" w:fill="D9D2E9"/>
+          </w:tcPr>
+          <w:p/>
+        </w:tc>
+        <w:tc>
+          <w:tcPr>
+            <w:tcW w:type="dxa" w:w="2160"/>
+          </w:tcPr>
+          <w:p>
+            <w:r>
+              <w:rPr>
+                <w:sz w:val="20"/>
+              </w:rPr>
+              <w:t>2.80</w:t>
+            </w:r>
+          </w:p>
+        </w:tc>
+        <w:tc>
+          <w:tcPr>
+            <w:tcW w:type="dxa" w:w="2160"/>
+          </w:tcPr>
+          <w:p>
+            <w:r>
+              <w:rPr>
+                <w:sz w:val="20"/>
+              </w:rPr>
+              <w:t>VR</w:t>
+            </w:r>
+          </w:p>
+        </w:tc>
+        <w:tc>
+          <w:tcPr>
+            <w:tcW w:type="dxa" w:w="2160"/>
+          </w:tcPr>
+          <w:p>
+            <w:r>
+              <w:rPr>
+                <w:sz w:val="20"/>
+              </w:rPr>
+              <w:t>15</w:t>
+            </w:r>
+          </w:p>
+        </w:tc>
+      </w:tr>
+      <w:tr>
+        <w:tc>
+          <w:tcPr>
+            <w:tcW w:type="dxa" w:w="2160"/>
+            <w:shd w:val="clear" w:color="auto" w:fill="FCE4D6"/>
+          </w:tcPr>
+          <w:p/>
+        </w:tc>
+        <w:tc>
+          <w:tcPr>
+            <w:tcW w:type="dxa" w:w="2160"/>
+          </w:tcPr>
+          <w:p>
+            <w:r>
+              <w:rPr>
+                <w:sz w:val="20"/>
+              </w:rPr>
+              <w:t>2.95</w:t>
+            </w:r>
+          </w:p>
+        </w:tc>
+        <w:tc>
+          <w:tcPr>
+            <w:tcW w:type="dxa" w:w="2160"/>
+          </w:tcPr>
+          <w:p>
+            <w:r>
+              <w:rPr>
+                <w:sz w:val="20"/>
+              </w:rPr>
+              <w:t>VR</w:t>
+            </w:r>
+          </w:p>
+        </w:tc>
+        <w:tc>
+          <w:tcPr>
+            <w:tcW w:type="dxa" w:w="2160"/>
+          </w:tcPr>
+          <w:p>
+            <w:r>
+              <w:rPr>
+                <w:sz w:val="20"/>
+              </w:rPr>
+              <w:t>10</w:t>
+            </w:r>
+          </w:p>
+        </w:tc>
+      </w:tr>
+      <w:tr>
+        <w:tc>
+          <w:tcPr>
+            <w:tcW w:type="dxa" w:w="2160"/>
+            <w:shd w:val="clear" w:color="auto" w:fill="A2C4C9"/>
+          </w:tcPr>
+          <w:p/>
+        </w:tc>
+        <w:tc>
+          <w:tcPr>
+            <w:tcW w:type="dxa" w:w="2160"/>
+          </w:tcPr>
+          <w:p>
+            <w:r>
+              <w:rPr>
+                <w:sz w:val="20"/>
+              </w:rPr>
+              <w:t>3.30</w:t>
+            </w:r>
+          </w:p>
+        </w:tc>
+        <w:tc>
+          <w:tcPr>
+            <w:tcW w:type="dxa" w:w="2160"/>
+          </w:tcPr>
+          <w:p>
+            <w:r>
+              <w:rPr>
+                <w:sz w:val="20"/>
+              </w:rPr>
+              <w:t>VR</w:t>
+            </w:r>
+          </w:p>
+        </w:tc>
+        <w:tc>
+          <w:tcPr>
+            <w:tcW w:type="dxa" w:w="2160"/>
+          </w:tcPr>
+          <w:p>
+            <w:r>
+              <w:rPr>
+                <w:sz w:val="20"/>
+              </w:rPr>
+              <w:t>10</w:t>
+            </w:r>
+          </w:p>
+        </w:tc>
+      </w:tr>
+      <w:tr>
+        <w:tc>
+          <w:tcPr>
+            <w:tcW w:type="dxa" w:w="2160"/>
+            <w:shd w:val="clear" w:color="auto" w:fill="EAD1DC"/>
+          </w:tcPr>
+          <w:p/>
+        </w:tc>
+        <w:tc>
+          <w:tcPr>
+            <w:tcW w:type="dxa" w:w="2160"/>
+          </w:tcPr>
+          <w:p>
+            <w:r>
+              <w:rPr>
+                <w:sz w:val="20"/>
+              </w:rPr>
+              <w:t>3.65</w:t>
+            </w:r>
+          </w:p>
+        </w:tc>
+        <w:tc>
+          <w:tcPr>
+            <w:tcW w:type="dxa" w:w="2160"/>
+          </w:tcPr>
+          <w:p>
+            <w:r>
+              <w:rPr>
+                <w:sz w:val="20"/>
+              </w:rPr>
+              <w:t>VR</w:t>
+            </w:r>
+          </w:p>
+        </w:tc>
+        <w:tc>
+          <w:tcPr>
+            <w:tcW w:type="dxa" w:w="2160"/>
+          </w:tcPr>
+          <w:p>
+            <w:r>
+              <w:rPr>
+                <w:sz w:val="20"/>
+              </w:rPr>
+              <w:t>40</w:t>
+            </w:r>
+          </w:p>
+        </w:tc>
+      </w:tr>
+      <w:tr>
+        <w:tc>
+          <w:tcPr>
+            <w:tcW w:type="dxa" w:w="2160"/>
+            <w:shd w:val="clear" w:color="auto" w:fill="D9EAD3"/>
+          </w:tcPr>
+          <w:p/>
+        </w:tc>
+        <w:tc>
+          <w:tcPr>
+            <w:tcW w:type="dxa" w:w="2160"/>
+          </w:tcPr>
+          <w:p>
+            <w:r>
+              <w:rPr>
+                <w:sz w:val="20"/>
+              </w:rPr>
+              <w:t>3.75</w:t>
+            </w:r>
+          </w:p>
+        </w:tc>
+        <w:tc>
+          <w:tcPr>
+            <w:tcW w:type="dxa" w:w="2160"/>
+          </w:tcPr>
+          <w:p>
+            <w:r>
+              <w:rPr>
+                <w:sz w:val="20"/>
+              </w:rPr>
+              <w:t>VC</w:t>
+            </w:r>
+          </w:p>
+        </w:tc>
+        <w:tc>
+          <w:tcPr>
+            <w:tcW w:type="dxa" w:w="2160"/>
+          </w:tcPr>
+          <w:p>
+            <w:r>
+              <w:rPr>
+                <w:sz w:val="20"/>
+              </w:rPr>
+              <w:t>40</w:t>
+            </w:r>
+          </w:p>
+        </w:tc>
+      </w:tr>
+      <w:tr>
+        <w:tc>
+          <w:tcPr>
+            <w:tcW w:type="dxa" w:w="2160"/>
+            <w:shd w:val="clear" w:color="auto" w:fill="FFF2CC"/>
+          </w:tcPr>
+          <w:p/>
+        </w:tc>
+        <w:tc>
+          <w:tcPr>
+            <w:tcW w:type="dxa" w:w="2160"/>
+          </w:tcPr>
+          <w:p>
+            <w:r>
+              <w:rPr>
+                <w:sz w:val="20"/>
+              </w:rPr>
+              <w:t>3.81</w:t>
+            </w:r>
+          </w:p>
+        </w:tc>
+        <w:tc>
+          <w:tcPr>
+            <w:tcW w:type="dxa" w:w="2160"/>
+          </w:tcPr>
+          <w:p>
+            <w:r>
+              <w:rPr>
+                <w:sz w:val="20"/>
+              </w:rPr>
+              <w:t>VC</w:t>
+            </w:r>
+          </w:p>
+        </w:tc>
+        <w:tc>
+          <w:tcPr>
+            <w:tcW w:type="dxa" w:w="2160"/>
+          </w:tcPr>
+          <w:p>
+            <w:r>
+              <w:rPr>
+                <w:sz w:val="20"/>
+              </w:rPr>
+              <w:t>20</w:t>
+            </w:r>
+          </w:p>
+        </w:tc>
+      </w:tr>
+      <w:tr>
+        <w:tc>
+          <w:tcPr>
+            <w:tcW w:type="dxa" w:w="2160"/>
+            <w:shd w:val="clear" w:color="auto" w:fill="CFE2F3"/>
+          </w:tcPr>
+          <w:p/>
+        </w:tc>
+        <w:tc>
+          <w:tcPr>
+            <w:tcW w:type="dxa" w:w="2160"/>
+          </w:tcPr>
+          <w:p>
+            <w:r>
+              <w:rPr>
+                <w:sz w:val="20"/>
+              </w:rPr>
+              <w:t>3.85</w:t>
+            </w:r>
+          </w:p>
+        </w:tc>
+        <w:tc>
+          <w:tcPr>
+            <w:tcW w:type="dxa" w:w="2160"/>
+          </w:tcPr>
+          <w:p>
+            <w:r>
+              <w:rPr>
+                <w:sz w:val="20"/>
+              </w:rPr>
+              <w:t>VC</w:t>
+            </w:r>
+          </w:p>
+        </w:tc>
+        <w:tc>
+          <w:tcPr>
+            <w:tcW w:type="dxa" w:w="2160"/>
+          </w:tcPr>
+          <w:p>
+            <w:r>
+              <w:rPr>
+                <w:sz w:val="20"/>
+              </w:rPr>
+              <w:t>60</w:t>
+            </w:r>
+          </w:p>
+        </w:tc>
+      </w:tr>
+      <w:tr>
+        <w:tc>
+          <w:tcPr>
+            <w:tcW w:type="dxa" w:w="2160"/>
+            <w:shd w:val="clear" w:color="auto" w:fill="F4CCCC"/>
+          </w:tcPr>
+          <w:p/>
+        </w:tc>
+        <w:tc>
+          <w:tcPr>
+            <w:tcW w:type="dxa" w:w="2160"/>
+          </w:tcPr>
+          <w:p>
+            <w:r>
+              <w:rPr>
+                <w:sz w:val="20"/>
+              </w:rPr>
+              <w:t>3.90</w:t>
+            </w:r>
+          </w:p>
+        </w:tc>
+        <w:tc>
+          <w:tcPr>
+            <w:tcW w:type="dxa" w:w="2160"/>
+          </w:tcPr>
+          <w:p>
+            <w:r>
+              <w:rPr>
+                <w:sz w:val="20"/>
+              </w:rPr>
+              <w:t>VC</w:t>
+            </w:r>
+          </w:p>
+        </w:tc>
+        <w:tc>
+          <w:tcPr>
+            <w:tcW w:type="dxa" w:w="2160"/>
+          </w:tcPr>
+          <w:p>
+            <w:r>
+              <w:rPr>
+                <w:sz w:val="20"/>
+              </w:rPr>
+              <w:t>40</w:t>
+            </w:r>
+          </w:p>
+        </w:tc>
+      </w:tr>
+      <w:tr>
+        <w:tc>
+          <w:tcPr>
+            <w:tcW w:type="dxa" w:w="2160"/>
+            <w:shd w:val="clear" w:color="auto" w:fill="D5A6BD"/>
+          </w:tcPr>
+          <w:p/>
+        </w:tc>
+        <w:tc>
+          <w:tcPr>
+            <w:tcW w:type="dxa" w:w="2160"/>
+          </w:tcPr>
+          <w:p>
+            <w:r>
+              <w:rPr>
+                <w:sz w:val="20"/>
+              </w:rPr>
+              <w:t>4.00</w:t>
+            </w:r>
+          </w:p>
+        </w:tc>
+        <w:tc>
+          <w:tcPr>
+            <w:tcW w:type="dxa" w:w="2160"/>
+          </w:tcPr>
+          <w:p>
+            <w:r>
+              <w:rPr>
+                <w:sz w:val="20"/>
+              </w:rPr>
+              <w:t>VC/VR (mixta)</w:t>
+            </w:r>
+          </w:p>
+        </w:tc>
+        <w:tc>
+          <w:tcPr>
+            <w:tcW w:type="dxa" w:w="2160"/>
+          </w:tcPr>
+          <w:p>
+            <w:r>
+              <w:rPr>
+                <w:sz w:val="20"/>
+              </w:rPr>
+              <w:t>70</w:t>
+            </w:r>
+          </w:p>
+        </w:tc>
+      </w:tr>
+      <w:tr>
+        <w:tc>
+          <w:tcPr>
+            <w:tcW w:type="dxa" w:w="2160"/>
+            <w:shd w:val="clear" w:color="auto" w:fill="B6D7A8"/>
+          </w:tcPr>
+          <w:p/>
+        </w:tc>
+        <w:tc>
+          <w:tcPr>
+            <w:tcW w:type="dxa" w:w="2160"/>
+          </w:tcPr>
+          <w:p>
+            <w:r>
+              <w:rPr>
+                <w:sz w:val="20"/>
+              </w:rPr>
+              <w:t>4.18</w:t>
+            </w:r>
+          </w:p>
+        </w:tc>
+        <w:tc>
+          <w:tcPr>
+            <w:tcW w:type="dxa" w:w="2160"/>
+          </w:tcPr>
+          <w:p>
+            <w:r>
+              <w:rPr>
+                <w:sz w:val="20"/>
+              </w:rPr>
+              <w:t>VR</w:t>
+            </w:r>
+          </w:p>
+        </w:tc>
+        <w:tc>
+          <w:tcPr>
+            <w:tcW w:type="dxa" w:w="2160"/>
+          </w:tcPr>
+          <w:p>
+            <w:r>
+              <w:rPr>
+                <w:sz w:val="20"/>
+              </w:rPr>
+              <w:t>20</w:t>
+            </w:r>
+          </w:p>
+        </w:tc>
+      </w:tr>
+      <w:tr>
+        <w:tc>
+          <w:tcPr>
+            <w:tcW w:type="dxa" w:w="2160"/>
+            <w:shd w:val="clear" w:color="auto" w:fill="FFD966"/>
+          </w:tcPr>
+          <w:p/>
+        </w:tc>
+        <w:tc>
+          <w:tcPr>
+            <w:tcW w:type="dxa" w:w="2160"/>
+          </w:tcPr>
+          <w:p>
+            <w:r>
+              <w:rPr>
+                <w:sz w:val="20"/>
+              </w:rPr>
+              <w:t>5.10</w:t>
+            </w:r>
+          </w:p>
+        </w:tc>
+        <w:tc>
+          <w:tcPr>
+            <w:tcW w:type="dxa" w:w="2160"/>
+          </w:tcPr>
+          <w:p>
+            <w:r>
+              <w:rPr>
+                <w:sz w:val="20"/>
+              </w:rPr>
+              <w:t>VC</w:t>
+            </w:r>
+          </w:p>
+        </w:tc>
+        <w:tc>
+          <w:tcPr>
+            <w:tcW w:type="dxa" w:w="2160"/>
+          </w:tcPr>
+          <w:p>
+            <w:r>
+              <w:rPr>
+                <w:sz w:val="20"/>
+              </w:rPr>
+              <w:t>20</w:t>
+            </w:r>
+          </w:p>
+        </w:tc>
+      </w:tr>
+      <w:tr>
+        <w:tc>
+          <w:tcPr>
+            <w:tcW w:type="dxa" w:w="2160"/>
+            <w:shd w:val="clear" w:color="auto" w:fill="C9DAF8"/>
+          </w:tcPr>
+          <w:p/>
+        </w:tc>
+        <w:tc>
+          <w:tcPr>
+            <w:tcW w:type="dxa" w:w="2160"/>
+          </w:tcPr>
+          <w:p>
+            <w:r>
+              <w:rPr>
+                <w:sz w:val="20"/>
+              </w:rPr>
+              <w:t>5.50</w:t>
+            </w:r>
+          </w:p>
+        </w:tc>
+        <w:tc>
+          <w:tcPr>
+            <w:tcW w:type="dxa" w:w="2160"/>
+          </w:tcPr>
+          <w:p>
+            <w:r>
+              <w:rPr>
+                <w:sz w:val="20"/>
+              </w:rPr>
+              <w:t>VR</w:t>
+            </w:r>
+          </w:p>
+        </w:tc>
+        <w:tc>
+          <w:tcPr>
+            <w:tcW w:type="dxa" w:w="2160"/>
+          </w:tcPr>
+          <w:p>
+            <w:r>
+              <w:rPr>
+                <w:sz w:val="20"/>
+              </w:rPr>
+              <w:t>2</w:t>
+            </w:r>
+          </w:p>
+        </w:tc>
+      </w:tr>
+      <w:tr>
+        <w:tc>
+          <w:tcPr>
+            <w:tcW w:type="dxa" w:w="2160"/>
+          </w:tcPr>
+          <w:p/>
+        </w:tc>
+        <w:tc>
+          <w:tcPr>
+            <w:tcW w:type="dxa" w:w="2160"/>
+          </w:tcPr>
+          <w:p>
+            <w:r>
+              <w:rPr>
+                <w:b/>
+              </w:rPr>
+              <w:t>TOTAL</w:t>
+            </w:r>
+          </w:p>
+        </w:tc>
+        <w:tc>
+          <w:tcPr>
+            <w:tcW w:type="dxa" w:w="2160"/>
+          </w:tcPr>
+          <w:p/>
+        </w:tc>
+        <w:tc>
+          <w:tcPr>
+            <w:tcW w:type="dxa" w:w="2160"/>
+          </w:tcPr>
+          <w:p>
+            <w:r>
+              <w:rPr>
+                <w:b/>
+              </w:rPr>
+              <w:t>592</w:t>
+            </w:r>
+          </w:p>
+        </w:tc>
+      </w:tr>
+    </w:tbl>
+    <w:p>
+      <w:pPr>
+        <w:jc w:val="both"/>
+      </w:pPr>
+      <w:r>
+        <w:rPr>
+          <w:b w:val="0"/>
+          <w:i/>
+          <w:sz w:val="18"/>
+        </w:rPr>
+        <w:t>Nota: el color agrupa por longitud; el grupo de diseño final considera además la condición de apoyo (extremo/interior). A continuación se muestra el esquema de la planta con las vigas coloreadas por grupo:</w:t>
+      </w:r>
+    </w:p>
+    <w:p>
+      <w:pPr>
+        <w:jc w:val="center"/>
+      </w:pPr>
+      <w:r>
+        <w:drawing>
+          <wp:inline xmlns:a="http://schemas.openxmlformats.org/drawingml/2006/main" xmlns:pic="http://schemas.openxmlformats.org/drawingml/2006/picture">
+            <wp:extent cx="4680000" cy="5793361"/>
+            <wp:docPr id="1" name="Picture 1"/>
+            <wp:cNvGraphicFramePr>
+              <a:graphicFrameLocks noChangeAspect="1"/>
+            </wp:cNvGraphicFramePr>
+            <a:graphic>
+              <a:graphicData uri="http://schemas.openxmlformats.org/drawingml/2006/picture">
+                <pic:pic>
+                  <pic:nvPicPr>
+                    <pic:cNvPr id="0" name="Planta-Agrupacion-Vigas.png"/>
+                    <pic:cNvPicPr/>
+                  </pic:nvPicPr>
+                  <pic:blipFill>
+                    <a:blip r:embed="rId9"/>
+                    <a:stretch>
+                      <a:fillRect/>
+                    </a:stretch>
+                  </pic:blipFill>
+                  <pic:spPr>
+                    <a:xfrm>
+                      <a:off x="0" y="0"/>
+                      <a:ext cx="4680000" cy="5793361"/>
+                    </a:xfrm>
+                    <a:prstGeom prst="rect"/>
+                  </pic:spPr>
+                </pic:pic>
+              </a:graphicData>
+            </a:graphic>
+          </wp:inline>
+        </w:drawing>
+      </w:r>
+    </w:p>
+    <w:p>
+      <w:pPr>
+        <w:jc w:val="center"/>
+      </w:pPr>
+      <w:r>
+        <w:rPr>
+          <w:i/>
+          <w:sz w:val="18"/>
+        </w:rPr>
+        <w:t>Figura 1. Agrupación de vigas sobre la planta (cada color = un grupo por longitud).</w:t>
       </w:r>
     </w:p>
     <w:p>

</xml_diff>